<commit_message>
march 23 meeting minutes added
</commit_message>
<xml_diff>
--- a/meeting minutes/group meeting minutes.docx
+++ b/meeting minutes/group meeting minutes.docx
@@ -125,10 +125,7 @@
         </w:numPr>
       </w:pPr>
       <w:r>
-        <w:t xml:space="preserve">upload submission document to notion project binder by </w:t>
-      </w:r>
-      <w:r>
-        <w:t>Thursday</w:t>
+        <w:t>upload submission document to notion project binder by Thursday</w:t>
       </w:r>
     </w:p>
     <w:p/>
@@ -341,6 +338,355 @@
       </w:r>
     </w:p>
     <w:p/>
+    <w:p>
+      <w:r>
+        <w:t>March 16, 2026</w:t>
+      </w:r>
+    </w:p>
+    <w:p>
+      <w:pPr>
+        <w:numPr>
+          <w:ilvl w:val="0"/>
+          <w:numId w:val="3"/>
+        </w:numPr>
+      </w:pPr>
+      <w:r>
+        <w:t>Discussion on tasks completed in the last week</w:t>
+      </w:r>
+    </w:p>
+    <w:p>
+      <w:pPr>
+        <w:numPr>
+          <w:ilvl w:val="0"/>
+          <w:numId w:val="3"/>
+        </w:numPr>
+      </w:pPr>
+      <w:r>
+        <w:t>Discussion on implementation of some methods and endpoints</w:t>
+      </w:r>
+    </w:p>
+    <w:p>
+      <w:pPr>
+        <w:numPr>
+          <w:ilvl w:val="0"/>
+          <w:numId w:val="3"/>
+        </w:numPr>
+      </w:pPr>
+      <w:r>
+        <w:t>Alignment of names for testing needed</w:t>
+      </w:r>
+    </w:p>
+    <w:p>
+      <w:pPr>
+        <w:numPr>
+          <w:ilvl w:val="0"/>
+          <w:numId w:val="3"/>
+        </w:numPr>
+      </w:pPr>
+      <w:r>
+        <w:t xml:space="preserve">Reports needs to be implemented </w:t>
+      </w:r>
+    </w:p>
+    <w:p>
+      <w:pPr>
+        <w:numPr>
+          <w:ilvl w:val="1"/>
+          <w:numId w:val="3"/>
+        </w:numPr>
+      </w:pPr>
+      <w:r>
+        <w:t>We will use mock data to test this functionality</w:t>
+      </w:r>
+    </w:p>
+    <w:p>
+      <w:pPr>
+        <w:numPr>
+          <w:ilvl w:val="1"/>
+          <w:numId w:val="3"/>
+        </w:numPr>
+      </w:pPr>
+      <w:r>
+        <w:t>The seed data will be handled by Leon as a task</w:t>
+      </w:r>
+    </w:p>
+    <w:p>
+      <w:pPr>
+        <w:numPr>
+          <w:ilvl w:val="0"/>
+          <w:numId w:val="3"/>
+        </w:numPr>
+      </w:pPr>
+      <w:r>
+        <w:t>Test cases for front end needs to start being compiled by testers</w:t>
+      </w:r>
+    </w:p>
+    <w:p>
+      <w:pPr>
+        <w:numPr>
+          <w:ilvl w:val="0"/>
+          <w:numId w:val="3"/>
+        </w:numPr>
+      </w:pPr>
+      <w:r>
+        <w:t>Informal deadline set for code and test case completion for two weeks from today</w:t>
+      </w:r>
+    </w:p>
+    <w:p>
+      <w:pPr>
+        <w:numPr>
+          <w:ilvl w:val="0"/>
+          <w:numId w:val="3"/>
+        </w:numPr>
+      </w:pPr>
+      <w:r>
+        <w:lastRenderedPageBreak/>
+        <w:t>Discussion on how we should handle emails – we will do this through the front end</w:t>
+      </w:r>
+    </w:p>
+    <w:p>
+      <w:pPr>
+        <w:numPr>
+          <w:ilvl w:val="0"/>
+          <w:numId w:val="3"/>
+        </w:numPr>
+      </w:pPr>
+      <w:r>
+        <w:t>Notion needs to be fixed so our project binder is accessible</w:t>
+      </w:r>
+    </w:p>
+    <w:p>
+      <w:pPr>
+        <w:numPr>
+          <w:ilvl w:val="0"/>
+          <w:numId w:val="3"/>
+        </w:numPr>
+      </w:pPr>
+      <w:r>
+        <w:t xml:space="preserve">Allocation of reports implementation to </w:t>
+      </w:r>
+      <w:proofErr w:type="spellStart"/>
+      <w:r>
+        <w:t>Jenis</w:t>
+      </w:r>
+      <w:proofErr w:type="spellEnd"/>
+    </w:p>
+    <w:p/>
+    <w:p>
+      <w:r>
+        <w:t>March 23, 2026</w:t>
+      </w:r>
+    </w:p>
+    <w:p>
+      <w:pPr>
+        <w:numPr>
+          <w:ilvl w:val="0"/>
+          <w:numId w:val="4"/>
+        </w:numPr>
+      </w:pPr>
+      <w:r>
+        <w:t>Discussion on tasks completed in the last week</w:t>
+      </w:r>
+    </w:p>
+    <w:p>
+      <w:pPr>
+        <w:numPr>
+          <w:ilvl w:val="0"/>
+          <w:numId w:val="4"/>
+        </w:numPr>
+      </w:pPr>
+      <w:r>
+        <w:t>Task for everyone to go and look at the system and see if anything is missing or not working</w:t>
+      </w:r>
+    </w:p>
+    <w:p>
+      <w:pPr>
+        <w:numPr>
+          <w:ilvl w:val="0"/>
+          <w:numId w:val="4"/>
+        </w:numPr>
+      </w:pPr>
+      <w:r>
+        <w:t>Task for deputy to generate checklist of features each section of the system should do so testers can look through and see what works in the program</w:t>
+      </w:r>
+    </w:p>
+    <w:p>
+      <w:pPr>
+        <w:numPr>
+          <w:ilvl w:val="0"/>
+          <w:numId w:val="4"/>
+        </w:numPr>
+      </w:pPr>
+      <w:r>
+        <w:t>Only section left is reports to be completed</w:t>
+      </w:r>
+    </w:p>
+    <w:p>
+      <w:pPr>
+        <w:numPr>
+          <w:ilvl w:val="0"/>
+          <w:numId w:val="4"/>
+        </w:numPr>
+      </w:pPr>
+      <w:r>
+        <w:t>Bug found – when user checkouts or logs in again as a different user and they had stock in their cart, this cart persists</w:t>
+      </w:r>
+    </w:p>
+    <w:p>
+      <w:pPr>
+        <w:numPr>
+          <w:ilvl w:val="1"/>
+          <w:numId w:val="4"/>
+        </w:numPr>
+      </w:pPr>
+      <w:r>
+        <w:t>Solution – clearing local cache so this problem does not persist</w:t>
+      </w:r>
+    </w:p>
+    <w:p>
+      <w:pPr>
+        <w:numPr>
+          <w:ilvl w:val="0"/>
+          <w:numId w:val="4"/>
+        </w:numPr>
+      </w:pPr>
+      <w:r>
+        <w:t>Question to ask consultant - What level of documentation is expected in the final submission for comments and implementation report</w:t>
+      </w:r>
+    </w:p>
+    <w:p>
+      <w:pPr>
+        <w:numPr>
+          <w:ilvl w:val="0"/>
+          <w:numId w:val="4"/>
+        </w:numPr>
+      </w:pPr>
+      <w:r>
+        <w:t>Question for consultant – will we get access to an example for the implementation report</w:t>
+      </w:r>
+    </w:p>
+    <w:p>
+      <w:pPr>
+        <w:numPr>
+          <w:ilvl w:val="0"/>
+          <w:numId w:val="4"/>
+        </w:numPr>
+      </w:pPr>
+      <w:r>
+        <w:t>Testing will be done on the frontend and when testing is done it points to the root test folder</w:t>
+      </w:r>
+    </w:p>
+    <w:p>
+      <w:pPr>
+        <w:numPr>
+          <w:ilvl w:val="0"/>
+          <w:numId w:val="4"/>
+        </w:numPr>
+      </w:pPr>
+      <w:r>
+        <w:t>Frontend - Update dashboard so only sections of the system they are allowed to see are shown when they log in</w:t>
+      </w:r>
+    </w:p>
+    <w:p>
+      <w:pPr>
+        <w:numPr>
+          <w:ilvl w:val="0"/>
+          <w:numId w:val="4"/>
+        </w:numPr>
+      </w:pPr>
+      <w:r>
+        <w:t>Frontend - Implement sign out screen</w:t>
+      </w:r>
+    </w:p>
+    <w:p>
+      <w:pPr>
+        <w:numPr>
+          <w:ilvl w:val="0"/>
+          <w:numId w:val="4"/>
+        </w:numPr>
+      </w:pPr>
+      <w:r>
+        <w:t xml:space="preserve">Blank error on </w:t>
+      </w:r>
+      <w:proofErr w:type="gramStart"/>
+      <w:r>
+        <w:t>create</w:t>
+      </w:r>
+      <w:proofErr w:type="gramEnd"/>
+      <w:r>
+        <w:t xml:space="preserve"> merchant account – everyone should poke around the system and find any more bugs</w:t>
+      </w:r>
+    </w:p>
+    <w:p>
+      <w:pPr>
+        <w:numPr>
+          <w:ilvl w:val="0"/>
+          <w:numId w:val="4"/>
+        </w:numPr>
+      </w:pPr>
+      <w:r>
+        <w:t>Change order dashboard for managers to show all orders as a list</w:t>
+      </w:r>
+    </w:p>
+    <w:p>
+      <w:pPr>
+        <w:numPr>
+          <w:ilvl w:val="0"/>
+          <w:numId w:val="4"/>
+        </w:numPr>
+      </w:pPr>
+      <w:r>
+        <w:t>Review brief – statuses of orders</w:t>
+      </w:r>
+    </w:p>
+    <w:p>
+      <w:pPr>
+        <w:numPr>
+          <w:ilvl w:val="0"/>
+          <w:numId w:val="4"/>
+        </w:numPr>
+      </w:pPr>
+      <w:r>
+        <w:t>Bug on orders in manager dashboard where orders aren’t being shown</w:t>
+      </w:r>
+    </w:p>
+    <w:p>
+      <w:pPr>
+        <w:numPr>
+          <w:ilvl w:val="0"/>
+          <w:numId w:val="4"/>
+        </w:numPr>
+      </w:pPr>
+      <w:r>
+        <w:t xml:space="preserve">Buffer the phase between when an order is </w:t>
+      </w:r>
+      <w:proofErr w:type="gramStart"/>
+      <w:r>
+        <w:t>placed</w:t>
+      </w:r>
+      <w:proofErr w:type="gramEnd"/>
+      <w:r>
+        <w:t xml:space="preserve"> and the status is changed to accepted – this is instantaneous at the moment</w:t>
+      </w:r>
+    </w:p>
+    <w:p>
+      <w:pPr>
+        <w:numPr>
+          <w:ilvl w:val="0"/>
+          <w:numId w:val="4"/>
+        </w:numPr>
+      </w:pPr>
+      <w:r>
+        <w:t xml:space="preserve">We will be using </w:t>
+      </w:r>
+      <w:proofErr w:type="spellStart"/>
+      <w:r>
+        <w:t>vitest</w:t>
+      </w:r>
+      <w:proofErr w:type="spellEnd"/>
+      <w:r>
+        <w:t xml:space="preserve"> as our testing framework</w:t>
+      </w:r>
+    </w:p>
     <w:p/>
     <w:sectPr>
       <w:pgSz w:w="11906" w:h="16838"/>
@@ -504,6 +850,232 @@
     </w:lvl>
   </w:abstractNum>
   <w:abstractNum w:abstractNumId="1" w15:restartNumberingAfterBreak="0">
+    <w:nsid w:val="2E744EC2"/>
+    <w:multiLevelType w:val="hybridMultilevel"/>
+    <w:tmpl w:val="3B1401DA"/>
+    <w:lvl w:ilvl="0" w:tplc="08090001">
+      <w:start w:val="1"/>
+      <w:numFmt w:val="bullet"/>
+      <w:lvlText w:val=""/>
+      <w:lvlJc w:val="left"/>
+      <w:pPr>
+        <w:ind w:left="720" w:hanging="360"/>
+      </w:pPr>
+      <w:rPr>
+        <w:rFonts w:ascii="Symbol" w:hAnsi="Symbol" w:hint="default"/>
+      </w:rPr>
+    </w:lvl>
+    <w:lvl w:ilvl="1" w:tplc="08090003">
+      <w:start w:val="1"/>
+      <w:numFmt w:val="bullet"/>
+      <w:lvlText w:val="o"/>
+      <w:lvlJc w:val="left"/>
+      <w:pPr>
+        <w:ind w:left="1440" w:hanging="360"/>
+      </w:pPr>
+      <w:rPr>
+        <w:rFonts w:ascii="Courier New" w:hAnsi="Courier New" w:cs="Courier New" w:hint="default"/>
+      </w:rPr>
+    </w:lvl>
+    <w:lvl w:ilvl="2" w:tplc="08090005">
+      <w:start w:val="1"/>
+      <w:numFmt w:val="bullet"/>
+      <w:lvlText w:val=""/>
+      <w:lvlJc w:val="left"/>
+      <w:pPr>
+        <w:ind w:left="2160" w:hanging="360"/>
+      </w:pPr>
+      <w:rPr>
+        <w:rFonts w:ascii="Wingdings" w:hAnsi="Wingdings" w:hint="default"/>
+      </w:rPr>
+    </w:lvl>
+    <w:lvl w:ilvl="3" w:tplc="08090001">
+      <w:start w:val="1"/>
+      <w:numFmt w:val="bullet"/>
+      <w:lvlText w:val=""/>
+      <w:lvlJc w:val="left"/>
+      <w:pPr>
+        <w:ind w:left="2880" w:hanging="360"/>
+      </w:pPr>
+      <w:rPr>
+        <w:rFonts w:ascii="Symbol" w:hAnsi="Symbol" w:hint="default"/>
+      </w:rPr>
+    </w:lvl>
+    <w:lvl w:ilvl="4" w:tplc="08090003">
+      <w:start w:val="1"/>
+      <w:numFmt w:val="bullet"/>
+      <w:lvlText w:val="o"/>
+      <w:lvlJc w:val="left"/>
+      <w:pPr>
+        <w:ind w:left="3600" w:hanging="360"/>
+      </w:pPr>
+      <w:rPr>
+        <w:rFonts w:ascii="Courier New" w:hAnsi="Courier New" w:cs="Courier New" w:hint="default"/>
+      </w:rPr>
+    </w:lvl>
+    <w:lvl w:ilvl="5" w:tplc="08090005">
+      <w:start w:val="1"/>
+      <w:numFmt w:val="bullet"/>
+      <w:lvlText w:val=""/>
+      <w:lvlJc w:val="left"/>
+      <w:pPr>
+        <w:ind w:left="4320" w:hanging="360"/>
+      </w:pPr>
+      <w:rPr>
+        <w:rFonts w:ascii="Wingdings" w:hAnsi="Wingdings" w:hint="default"/>
+      </w:rPr>
+    </w:lvl>
+    <w:lvl w:ilvl="6" w:tplc="08090001">
+      <w:start w:val="1"/>
+      <w:numFmt w:val="bullet"/>
+      <w:lvlText w:val=""/>
+      <w:lvlJc w:val="left"/>
+      <w:pPr>
+        <w:ind w:left="5040" w:hanging="360"/>
+      </w:pPr>
+      <w:rPr>
+        <w:rFonts w:ascii="Symbol" w:hAnsi="Symbol" w:hint="default"/>
+      </w:rPr>
+    </w:lvl>
+    <w:lvl w:ilvl="7" w:tplc="08090003">
+      <w:start w:val="1"/>
+      <w:numFmt w:val="bullet"/>
+      <w:lvlText w:val="o"/>
+      <w:lvlJc w:val="left"/>
+      <w:pPr>
+        <w:ind w:left="5760" w:hanging="360"/>
+      </w:pPr>
+      <w:rPr>
+        <w:rFonts w:ascii="Courier New" w:hAnsi="Courier New" w:cs="Courier New" w:hint="default"/>
+      </w:rPr>
+    </w:lvl>
+    <w:lvl w:ilvl="8" w:tplc="08090005">
+      <w:start w:val="1"/>
+      <w:numFmt w:val="bullet"/>
+      <w:lvlText w:val=""/>
+      <w:lvlJc w:val="left"/>
+      <w:pPr>
+        <w:ind w:left="6480" w:hanging="360"/>
+      </w:pPr>
+      <w:rPr>
+        <w:rFonts w:ascii="Wingdings" w:hAnsi="Wingdings" w:hint="default"/>
+      </w:rPr>
+    </w:lvl>
+  </w:abstractNum>
+  <w:abstractNum w:abstractNumId="2" w15:restartNumberingAfterBreak="0">
+    <w:nsid w:val="4BAD5E19"/>
+    <w:multiLevelType w:val="hybridMultilevel"/>
+    <w:tmpl w:val="9866FFAC"/>
+    <w:lvl w:ilvl="0" w:tplc="08090001">
+      <w:start w:val="1"/>
+      <w:numFmt w:val="bullet"/>
+      <w:lvlText w:val=""/>
+      <w:lvlJc w:val="left"/>
+      <w:pPr>
+        <w:ind w:left="720" w:hanging="360"/>
+      </w:pPr>
+      <w:rPr>
+        <w:rFonts w:ascii="Symbol" w:hAnsi="Symbol" w:hint="default"/>
+      </w:rPr>
+    </w:lvl>
+    <w:lvl w:ilvl="1" w:tplc="FFFFFFFF">
+      <w:start w:val="1"/>
+      <w:numFmt w:val="bullet"/>
+      <w:lvlText w:val="o"/>
+      <w:lvlJc w:val="left"/>
+      <w:pPr>
+        <w:ind w:left="1440" w:hanging="360"/>
+      </w:pPr>
+      <w:rPr>
+        <w:rFonts w:ascii="Courier New" w:hAnsi="Courier New" w:cs="Times New Roman" w:hint="default"/>
+      </w:rPr>
+    </w:lvl>
+    <w:lvl w:ilvl="2" w:tplc="FFFFFFFF">
+      <w:start w:val="1"/>
+      <w:numFmt w:val="bullet"/>
+      <w:lvlText w:val=""/>
+      <w:lvlJc w:val="left"/>
+      <w:pPr>
+        <w:ind w:left="2160" w:hanging="360"/>
+      </w:pPr>
+      <w:rPr>
+        <w:rFonts w:ascii="Wingdings" w:hAnsi="Wingdings" w:hint="default"/>
+      </w:rPr>
+    </w:lvl>
+    <w:lvl w:ilvl="3" w:tplc="FFFFFFFF">
+      <w:start w:val="1"/>
+      <w:numFmt w:val="bullet"/>
+      <w:lvlText w:val=""/>
+      <w:lvlJc w:val="left"/>
+      <w:pPr>
+        <w:ind w:left="2880" w:hanging="360"/>
+      </w:pPr>
+      <w:rPr>
+        <w:rFonts w:ascii="Symbol" w:hAnsi="Symbol" w:hint="default"/>
+      </w:rPr>
+    </w:lvl>
+    <w:lvl w:ilvl="4" w:tplc="FFFFFFFF">
+      <w:start w:val="1"/>
+      <w:numFmt w:val="bullet"/>
+      <w:lvlText w:val="o"/>
+      <w:lvlJc w:val="left"/>
+      <w:pPr>
+        <w:ind w:left="3600" w:hanging="360"/>
+      </w:pPr>
+      <w:rPr>
+        <w:rFonts w:ascii="Courier New" w:hAnsi="Courier New" w:cs="Times New Roman" w:hint="default"/>
+      </w:rPr>
+    </w:lvl>
+    <w:lvl w:ilvl="5" w:tplc="FFFFFFFF">
+      <w:start w:val="1"/>
+      <w:numFmt w:val="bullet"/>
+      <w:lvlText w:val=""/>
+      <w:lvlJc w:val="left"/>
+      <w:pPr>
+        <w:ind w:left="4320" w:hanging="360"/>
+      </w:pPr>
+      <w:rPr>
+        <w:rFonts w:ascii="Wingdings" w:hAnsi="Wingdings" w:hint="default"/>
+      </w:rPr>
+    </w:lvl>
+    <w:lvl w:ilvl="6" w:tplc="FFFFFFFF">
+      <w:start w:val="1"/>
+      <w:numFmt w:val="bullet"/>
+      <w:lvlText w:val=""/>
+      <w:lvlJc w:val="left"/>
+      <w:pPr>
+        <w:ind w:left="5040" w:hanging="360"/>
+      </w:pPr>
+      <w:rPr>
+        <w:rFonts w:ascii="Symbol" w:hAnsi="Symbol" w:hint="default"/>
+      </w:rPr>
+    </w:lvl>
+    <w:lvl w:ilvl="7" w:tplc="FFFFFFFF">
+      <w:start w:val="1"/>
+      <w:numFmt w:val="bullet"/>
+      <w:lvlText w:val="o"/>
+      <w:lvlJc w:val="left"/>
+      <w:pPr>
+        <w:ind w:left="5760" w:hanging="360"/>
+      </w:pPr>
+      <w:rPr>
+        <w:rFonts w:ascii="Courier New" w:hAnsi="Courier New" w:cs="Times New Roman" w:hint="default"/>
+      </w:rPr>
+    </w:lvl>
+    <w:lvl w:ilvl="8" w:tplc="FFFFFFFF">
+      <w:start w:val="1"/>
+      <w:numFmt w:val="bullet"/>
+      <w:lvlText w:val=""/>
+      <w:lvlJc w:val="left"/>
+      <w:pPr>
+        <w:ind w:left="6480" w:hanging="360"/>
+      </w:pPr>
+      <w:rPr>
+        <w:rFonts w:ascii="Wingdings" w:hAnsi="Wingdings" w:hint="default"/>
+      </w:rPr>
+    </w:lvl>
+  </w:abstractNum>
+  <w:abstractNum w:abstractNumId="3" w15:restartNumberingAfterBreak="0">
     <w:nsid w:val="5F046E90"/>
     <w:multiLevelType w:val="multilevel"/>
     <w:tmpl w:val="D312F0D0"/>
@@ -656,7 +1228,31 @@
     <w:abstractNumId w:val="0"/>
   </w:num>
   <w:num w:numId="2" w16cid:durableId="1934237739">
+    <w:abstractNumId w:val="3"/>
+  </w:num>
+  <w:num w:numId="3" w16cid:durableId="1071804569">
+    <w:abstractNumId w:val="2"/>
+    <w:lvlOverride w:ilvl="0"/>
+    <w:lvlOverride w:ilvl="1"/>
+    <w:lvlOverride w:ilvl="2"/>
+    <w:lvlOverride w:ilvl="3"/>
+    <w:lvlOverride w:ilvl="4"/>
+    <w:lvlOverride w:ilvl="5"/>
+    <w:lvlOverride w:ilvl="6"/>
+    <w:lvlOverride w:ilvl="7"/>
+    <w:lvlOverride w:ilvl="8"/>
+  </w:num>
+  <w:num w:numId="4" w16cid:durableId="790631699">
     <w:abstractNumId w:val="1"/>
+    <w:lvlOverride w:ilvl="0"/>
+    <w:lvlOverride w:ilvl="1"/>
+    <w:lvlOverride w:ilvl="2"/>
+    <w:lvlOverride w:ilvl="3"/>
+    <w:lvlOverride w:ilvl="4"/>
+    <w:lvlOverride w:ilvl="5"/>
+    <w:lvlOverride w:ilvl="6"/>
+    <w:lvlOverride w:ilvl="7"/>
+    <w:lvlOverride w:ilvl="8"/>
   </w:num>
 </w:numbering>
 </file>

</xml_diff>